<commit_message>
docs: fix pull request count in report
Co-authored-by: Cursor <cursoragent@cursor.com>
</commit_message>
<xml_diff>
--- a/docs/Relatorio_Status_Multiplagier_Mobile.docx
+++ b/docs/Relatorio_Status_Multiplagier_Mobile.docx
@@ -433,7 +433,7 @@
             <w:pPr>
               <w:spacing w:after="40"/>
             </w:pPr>
-            <w:hyperlink w:history="1" r:id="rIdvxmbg9aieghnrzbs2gjda">
+            <w:hyperlink w:history="1" r:id="rIdh_5tl-73g_tvekbhdgsh4">
               <w:r>
                 <w:rPr>
                   <w:rFonts w:ascii="Calibri" w:cs="Calibri" w:eastAsia="Calibri" w:hAnsi="Calibri"/>
@@ -3069,7 +3069,7 @@
                 <w:sz w:val="20"/>
                 <w:szCs w:val="20"/>
               </w:rPr>
-              <w:t xml:space="preserve">Código-fonte, commits atômicos e 3 pull requests (scaffold, login, catálogo) integrados na branch dev.</w:t>
+              <w:t xml:space="preserve">Código-fonte, commits atômicos e 4 pull requests (scaffold, login, catálogo e este relatório) integrados na branch dev.</w:t>
             </w:r>
           </w:p>
         </w:tc>
@@ -3225,7 +3225,7 @@
         </w:rPr>
         <w:t xml:space="preserve">Links: </w:t>
       </w:r>
-      <w:hyperlink w:history="1" r:id="rIdaxhserb6friydj7n0muum">
+      <w:hyperlink w:history="1" r:id="rIdmpmahjvmux1el1ajmj2jh">
         <w:r>
           <w:rPr>
             <w:rFonts w:ascii="Calibri" w:cs="Calibri" w:eastAsia="Calibri" w:hAnsi="Calibri"/>
@@ -3245,7 +3245,7 @@
         </w:rPr>
         <w:t xml:space="preserve"> | </w:t>
       </w:r>
-      <w:hyperlink w:history="1" r:id="rIdm-vxm4c30ngswb00iiqwu">
+      <w:hyperlink w:history="1" r:id="rIdqm3uzbmgtqk-sa5ycwcxl">
         <w:r>
           <w:rPr>
             <w:rFonts w:ascii="Calibri" w:cs="Calibri" w:eastAsia="Calibri" w:hAnsi="Calibri"/>
@@ -3265,7 +3265,7 @@
         </w:rPr>
         <w:t xml:space="preserve"> | </w:t>
       </w:r>
-      <w:hyperlink w:history="1" r:id="rId3hlkvs0cfmioc6rwq1jjb">
+      <w:hyperlink w:history="1" r:id="rIdurfwuc04gqglg4s_cujub">
         <w:r>
           <w:rPr>
             <w:rFonts w:ascii="Calibri" w:cs="Calibri" w:eastAsia="Calibri" w:hAnsi="Calibri"/>

</xml_diff>